<commit_message>
Rewrite backend from Python FastAPI to Node.js Express for Vercel harmony
</commit_message>
<xml_diff>
--- a/AI_Agents/test_plan_document/Test Plan - Template.docx
+++ b/AI_Agents/test_plan_document/Test Plan - Template.docx
@@ -6963,6 +6963,19 @@
           <w:rtl w:val="0"/>
         </w:rPr>
         <w:tab/>
+      </w:r>
+    </w:p>
+    <w:p>
+      <w:pPr>
+        <w:pStyle w:val="Heading1"/>
+      </w:pPr>
+      <w:r>
+        <w:t>Generated Test Plan Content</w:t>
+      </w:r>
+    </w:p>
+    <w:p>
+      <w:r>
+        <w:t>{{TEST_PLAN_CONTENT}}</w:t>
       </w:r>
     </w:p>
     <w:sectPr>

</xml_diff>